<commit_message>
docs(release-evidence): pin candidate 6e09ced; document HTML-path interrupt + deadline threading
- COVERAGE_MATRIX + REVIEW_PACKAGE: candidate pinned to 6e09ced, lineage appended
- §5b: HTML-path bounded interrupt now proven (subtest 5b.2, settleLatency<3000ms);
  path-isolated mutation (neutralise fetchWithBrowser wiring) -> 8108ms, PDF still passes
- §6: gap 1 (HTML path not wired) RESOLVED; gap 2 reframed (deadline threaded at
  nav+settle layers; residual = deep per-socket timeout not asserted); gap 4 live-validation
- counts updated to 34 node:test subtests / 94 total checks; regenerated docx+pdf siblings
</commit_message>
<xml_diff>
--- a/deliverables/release-evidence/COVERAGE_MATRIX.docx
+++ b/deliverables/release-evidence/COVERAGE_MATRIX.docx
@@ -2,7 +2,7 @@
 <file path=word/document.xml><?xml version="1.0" encoding="utf-8"?>
 <w:document xmlns:w="http://schemas.openxmlformats.org/wordprocessingml/2006/main" xmlns:m="http://schemas.openxmlformats.org/officeDocument/2006/math" xmlns:r="http://schemas.openxmlformats.org/officeDocument/2006/relationships" xmlns:o="urn:schemas-microsoft-com:office:office" xmlns:v="urn:schemas-microsoft-com:vml" xmlns:w10="urn:schemas-microsoft-com:office:word" xmlns:a="http://schemas.openxmlformats.org/drawingml/2006/main" xmlns:pic="http://schemas.openxmlformats.org/drawingml/2006/picture" xmlns:wp="http://schemas.openxmlformats.org/drawingml/2006/wordprocessingDrawing">
   <w:body>
-    <w:bookmarkStart w:id="31" w:name="X5aa6b8120f829a0f053e4a397cb944e278ea818"/>
+    <w:bookmarkStart w:id="31" w:name="X199f60019d4e4ee01d68eb0c9fe523816ba8dce"/>
     <w:p>
       <w:pPr>
         <w:pStyle w:val="Heading1"/>
@@ -14,7 +14,7 @@
         <w:rPr>
           <w:rStyle w:val="VerbatimChar"/>
         </w:rPr>
-        <w:t xml:space="preserve">45cc661</w:t>
+        <w:t xml:space="preserve">6e09ced</w:t>
       </w:r>
       <w:r>
         <w:t xml:space="preserve">)</w:t>
@@ -57,7 +57,7 @@
                 <w:bCs/>
                 <w:b/>
               </w:rPr>
-              <w:t xml:space="preserve">45cc661d2898e52ad8512083929535d1667050d7</w:t>
+              <w:t xml:space="preserve">6e09ced4bf42d036c257cb35772335600215ff30</w:t>
             </w:r>
             <w:r>
               <w:t xml:space="preserve"> </w:t>
@@ -152,7 +152,7 @@
               <w:t xml:space="preserve"> </w:t>
             </w:r>
             <w:r>
-              <w:t xml:space="preserve">(bounded in-flight browser interruption) →</w:t>
+              <w:t xml:space="preserve">(bounded in-flight browser interruption, PDF path) →</w:t>
             </w:r>
             <w:r>
               <w:t xml:space="preserve"> </w:t>
@@ -182,7 +182,66 @@
               <w:t xml:space="preserve"> </w:t>
             </w:r>
             <w:r>
-              <w:t xml:space="preserve">(real-IPC proc-admission withdrawal test + explicit unattempted-URL outcomes)</w:t>
+              <w:t xml:space="preserve">(real-IPC proc-admission withdrawal test + explicit unattempted-URL outcomes) →</w:t>
+            </w:r>
+            <w:r>
+              <w:t xml:space="preserve"> </w:t>
+            </w:r>
+            <w:r>
+              <w:rPr>
+                <w:rStyle w:val="VerbatimChar"/>
+              </w:rPr>
+              <w:t xml:space="preserve">658a17c</w:t>
+            </w:r>
+            <w:r>
+              <w:t xml:space="preserve"> </w:t>
+            </w:r>
+            <w:r>
+              <w:t xml:space="preserve">(deadline threading into browser nav timeouts via</w:t>
+            </w:r>
+            <w:r>
+              <w:t xml:space="preserve"> </w:t>
+            </w:r>
+            <w:r>
+              <w:rPr>
+                <w:rStyle w:val="VerbatimChar"/>
+              </w:rPr>
+              <w:t xml:space="preserve">remainingMs</w:t>
+            </w:r>
+            <w:r>
+              <w:t xml:space="preserve">) →</w:t>
+            </w:r>
+            <w:r>
+              <w:t xml:space="preserve"> </w:t>
+            </w:r>
+            <w:r>
+              <w:rPr>
+                <w:rStyle w:val="VerbatimChar"/>
+                <w:bCs/>
+                <w:b/>
+              </w:rPr>
+              <w:t xml:space="preserve">6e09ced</w:t>
+            </w:r>
+            <w:r>
+              <w:t xml:space="preserve"> </w:t>
+            </w:r>
+            <w:r>
+              <w:t xml:space="preserve">(bounded in-flight interruption wired into the</w:t>
+            </w:r>
+            <w:r>
+              <w:t xml:space="preserve"> </w:t>
+            </w:r>
+            <w:r>
+              <w:rPr>
+                <w:rStyle w:val="VerbatimChar"/>
+              </w:rPr>
+              <w:t xml:space="preserve">fetchWithBrowser</w:t>
+            </w:r>
+            <w:r>
+              <w:t xml:space="preserve"> </w:t>
+            </w:r>
+            <w:r>
+              <w:t xml:space="preserve">HTML path + abort-aware settle waits)</w:t>
             </w:r>
           </w:p>
         </w:tc>
@@ -4875,7 +4934,7 @@
         <w:t xml:space="preserve"> </w:t>
       </w:r>
       <w:r>
-        <w:t xml:space="preserve">and cancellation at this layer takes effect at the</w:t>
+        <w:t xml:space="preserve">and cancellation</w:t>
       </w:r>
       <w:r>
         <w:t xml:space="preserve"> </w:t>
@@ -4885,10 +4944,13 @@
           <w:bCs/>
           <w:b/>
         </w:rPr>
-        <w:t xml:space="preserve">next gate</w:t>
-      </w:r>
-      <w:r>
-        <w:t xml:space="preserve">. The bounded mid-flight interruption of the active CDP op is a separate, newly-added path — §5b — and remains</w:t>
+        <w:t xml:space="preserve">at this close/reap-ordering layer</w:t>
+      </w:r>
+      <w:r>
+        <w:t xml:space="preserve"> </w:t>
+      </w:r>
+      <w:r>
+        <w:t xml:space="preserve">takes effect at the</w:t>
       </w:r>
       <w:r>
         <w:t xml:space="preserve"> </w:t>
@@ -4898,13 +4960,10 @@
           <w:bCs/>
           <w:b/>
         </w:rPr>
-        <w:t xml:space="preserve">partial</w:t>
-      </w:r>
-      <w:r>
-        <w:t xml:space="preserve"> </w:t>
-      </w:r>
-      <w:r>
-        <w:t xml:space="preserve">(see §6/§7).</w:t>
+        <w:t xml:space="preserve">next gate</w:t>
+      </w:r>
+      <w:r>
+        <w:t xml:space="preserve">. The bounded mid-flight interruption of the active CDP op is a separate path — §5b — now wired into both the PDF and HTML browser paths; its one honest residual (a deep per-socket read timeout) is in §6.2.</w:t>
       </w:r>
     </w:p>
     <w:p>
@@ -4915,13 +4974,29 @@
       </w:r>
     </w:p>
     <w:bookmarkEnd w:id="26"/>
-    <w:bookmarkStart w:id="27" w:name="X7636bb2abf7dc506064a0d851e621532e536add"/>
+    <w:bookmarkStart w:id="27" w:name="Xbcf195f9368cead0694f67446a103f14ab777b5"/>
     <w:p>
       <w:pPr>
         <w:pStyle w:val="Heading2"/>
       </w:pPr>
       <w:r>
-        <w:t xml:space="preserve">5b. Bounded in-flight interruption of an active browser op (real Chromium page)</w:t>
+        <w:t xml:space="preserve">5b. Bounded in-flight interruption of an active browser op (real Chromium page) — both PDF</w:t>
+      </w:r>
+      <w:r>
+        <w:t xml:space="preserve"> </w:t>
+      </w:r>
+      <w:r>
+        <w:rPr>
+          <w:bCs/>
+          <w:b/>
+        </w:rPr>
+        <w:t xml:space="preserve">and</w:t>
+      </w:r>
+      <w:r>
+        <w:t xml:space="preserve"> </w:t>
+      </w:r>
+      <w:r>
+        <w:t xml:space="preserve">HTML paths</w:t>
       </w:r>
     </w:p>
     <w:p>
@@ -4944,24 +5019,68 @@
         <w:t xml:space="preserve"> </w:t>
       </w:r>
       <w:r>
-        <w:t xml:space="preserve">(processor.ts), wired into the</w:t>
-      </w:r>
-      <w:r>
-        <w:t xml:space="preserve"> </w:t>
-      </w:r>
-      <w:r>
-        <w:rPr>
-          <w:rStyle w:val="VerbatimChar"/>
+        <w:t xml:space="preserve">(processor.ts), now wired into</w:t>
+      </w:r>
+      <w:r>
+        <w:t xml:space="preserve"> </w:t>
+      </w:r>
+      <w:r>
+        <w:rPr>
           <w:bCs/>
           <w:b/>
         </w:rPr>
+        <w:t xml:space="preserve">all three</w:t>
+      </w:r>
+      <w:r>
+        <w:t xml:space="preserve"> </w:t>
+      </w:r>
+      <w:r>
+        <w:t xml:space="preserve">production browser call sites —</w:t>
+      </w:r>
+      <w:r>
+        <w:t xml:space="preserve"> </w:t>
+      </w:r>
+      <w:r>
+        <w:rPr>
+          <w:rStyle w:val="VerbatimChar"/>
+        </w:rPr>
         <w:t xml:space="preserve">fetchPdfViaBrowser</w:t>
       </w:r>
       <w:r>
         <w:t xml:space="preserve"> </w:t>
       </w:r>
       <w:r>
-        <w:t xml:space="preserve">path. On scope abort it drives the active page toward settlement within</w:t>
+        <w:t xml:space="preserve">(line ~2021),</w:t>
+      </w:r>
+      <w:r>
+        <w:t xml:space="preserve"> </w:t>
+      </w:r>
+      <w:r>
+        <w:rPr>
+          <w:rStyle w:val="VerbatimChar"/>
+        </w:rPr>
+        <w:t xml:space="preserve">fetchWithBrowser</w:t>
+      </w:r>
+      <w:r>
+        <w:t xml:space="preserve"> </w:t>
+      </w:r>
+      <w:r>
+        <w:t xml:space="preserve">(the HTML path, line ~1506), and</w:t>
+      </w:r>
+      <w:r>
+        <w:t xml:space="preserve"> </w:t>
+      </w:r>
+      <w:r>
+        <w:rPr>
+          <w:rStyle w:val="VerbatimChar"/>
+        </w:rPr>
+        <w:t xml:space="preserve">fetchIssuerPdfsWithPrimedSession</w:t>
+      </w:r>
+      <w:r>
+        <w:t xml:space="preserve"> </w:t>
+      </w:r>
+      <w:r>
+        <w:t xml:space="preserve">(line ~2298). On scope abort it drives the active page toward settlement within</w:t>
       </w:r>
       <w:r>
         <w:t xml:space="preserve"> </w:t>
@@ -4976,7 +5095,101 @@
         <w:t xml:space="preserve"> </w:t>
       </w:r>
       <w:r>
-        <w:t xml:space="preserve">(500 ms) plus a gate round-trip, rather than letting the in-flight CDP op run to its own timeout.</w:t>
+        <w:t xml:space="preserve">(500 ms) plus a gate round-trip, rather than letting the in-flight CDP op run to its own timeout. On the HTML path two supporting changes close the last fixed-wall-clock gaps: the two post-navigation settle waits are now</w:t>
+      </w:r>
+      <w:r>
+        <w:t xml:space="preserve"> </w:t>
+      </w:r>
+      <w:r>
+        <w:rPr>
+          <w:rStyle w:val="VerbatimChar"/>
+        </w:rPr>
+        <w:t xml:space="preserve">abortableDelay(2000, scope)</w:t>
+      </w:r>
+      <w:r>
+        <w:t xml:space="preserve"> </w:t>
+      </w:r>
+      <w:r>
+        <w:t xml:space="preserve">(resolve early on abort instead of always burning 2 s), and the catch block converts the puppeteer</w:t>
+      </w:r>
+      <w:r>
+        <w:t xml:space="preserve"> </w:t>
+      </w:r>
+      <w:r>
+        <w:t xml:space="preserve">“</w:t>
+      </w:r>
+      <w:r>
+        <w:t xml:space="preserve">Target closed</w:t>
+      </w:r>
+      <w:r>
+        <w:t xml:space="preserve">”</w:t>
+      </w:r>
+      <w:r>
+        <w:t xml:space="preserve"> </w:t>
+      </w:r>
+      <w:r>
+        <w:t xml:space="preserve">/</w:t>
+      </w:r>
+      <w:r>
+        <w:t xml:space="preserve"> </w:t>
+      </w:r>
+      <w:r>
+        <w:t xml:space="preserve">“</w:t>
+      </w:r>
+      <w:r>
+        <w:t xml:space="preserve">detached frame</w:t>
+      </w:r>
+      <w:r>
+        <w:t xml:space="preserve">”</w:t>
+      </w:r>
+      <w:r>
+        <w:t xml:space="preserve"> </w:t>
+      </w:r>
+      <w:r>
+        <w:t xml:space="preserve">rejection that the forced page-close produces</w:t>
+      </w:r>
+      <w:r>
+        <w:t xml:space="preserve"> </w:t>
+      </w:r>
+      <w:r>
+        <w:rPr>
+          <w:bCs/>
+          <w:b/>
+        </w:rPr>
+        <w:t xml:space="preserve">after</w:t>
+      </w:r>
+      <w:r>
+        <w:t xml:space="preserve"> </w:t>
+      </w:r>
+      <w:r>
+        <w:t xml:space="preserve">an abort into a retryable</w:t>
+      </w:r>
+      <w:r>
+        <w:t xml:space="preserve"> </w:t>
+      </w:r>
+      <w:r>
+        <w:rPr>
+          <w:rStyle w:val="VerbatimChar"/>
+        </w:rPr>
+        <w:t xml:space="preserve">OperationAbortedError(…, "browser_html_interrupted")</w:t>
+      </w:r>
+      <w:r>
+        <w:t xml:space="preserve">, so an interrupted HTML fetch surfaces an explicit abort rather than silently returning</w:t>
+      </w:r>
+      <w:r>
+        <w:t xml:space="preserve"> </w:t>
+      </w:r>
+      <w:r>
+        <w:rPr>
+          <w:rStyle w:val="VerbatimChar"/>
+        </w:rPr>
+        <w:t xml:space="preserve">""</w:t>
+      </w:r>
+      <w:r>
+        <w:t xml:space="preserve"> </w:t>
+      </w:r>
+      <w:r>
+        <w:t xml:space="preserve">(a dead URL).</w:t>
       </w:r>
     </w:p>
     <w:tbl>
@@ -5079,7 +5292,7 @@
               <w:jc w:val="left"/>
             </w:pPr>
             <w:r>
-              <w:t xml:space="preserve">A browser op</w:t>
+              <w:t xml:space="preserve">A</w:t>
             </w:r>
             <w:r>
               <w:t xml:space="preserve"> </w:t>
@@ -5089,13 +5302,13 @@
                 <w:bCs/>
                 <w:b/>
               </w:rPr>
-              <w:t xml:space="preserve">already in flight</w:t>
-            </w:r>
-            <w:r>
-              <w:t xml:space="preserve"> </w:t>
-            </w:r>
-            <w:r>
-              <w:t xml:space="preserve">when the scope aborts is driven to settle within the grace bound, not left to its own long timeout</w:t>
+              <w:t xml:space="preserve">PDF</w:t>
+            </w:r>
+            <w:r>
+              <w:t xml:space="preserve"> </w:t>
+            </w:r>
+            <w:r>
+              <w:t xml:space="preserve">browser op already in flight when the scope aborts is driven to settle within the grace bound, not left to its own long timeout</w:t>
             </w:r>
           </w:p>
         </w:tc>
@@ -5111,6 +5324,12 @@
                 <w:rStyle w:val="VerbatimChar"/>
               </w:rPr>
               <w:t xml:space="preserve">browser-inflight-interrupt.test.ts</w:t>
+            </w:r>
+            <w:r>
+              <w:t xml:space="preserve"> </w:t>
+            </w:r>
+            <w:r>
+              <w:t xml:space="preserve">:: B-browser (PDF)</w:t>
             </w:r>
           </w:p>
         </w:tc>
@@ -5153,7 +5372,179 @@
               <w:t xml:space="preserve"> </w:t>
             </w:r>
             <w:r>
-              <w:t xml:space="preserve">+ gate round-trip)</w:t>
+              <w:t xml:space="preserve">+ gate round-trip); throws</w:t>
+            </w:r>
+            <w:r>
+              <w:t xml:space="preserve"> </w:t>
+            </w:r>
+            <w:r>
+              <w:rPr>
+                <w:rStyle w:val="VerbatimChar"/>
+              </w:rPr>
+              <w:t xml:space="preserve">OperationAbortedError</w:t>
+            </w:r>
+          </w:p>
+        </w:tc>
+        <w:tc>
+          <w:tcPr/>
+          <w:p>
+            <w:pPr>
+              <w:pStyle w:val="Compact"/>
+              <w:jc w:val="left"/>
+            </w:pPr>
+            <w:r>
+              <w:rPr>
+                <w:bCs/>
+                <w:b/>
+              </w:rPr>
+              <w:t xml:space="preserve">R(page)</w:t>
+            </w:r>
+          </w:p>
+        </w:tc>
+      </w:tr>
+      <w:tr>
+        <w:tc>
+          <w:tcPr/>
+          <w:p>
+            <w:pPr>
+              <w:pStyle w:val="Compact"/>
+              <w:jc w:val="left"/>
+            </w:pPr>
+            <w:r>
+              <w:t xml:space="preserve">5b.2</w:t>
+            </w:r>
+          </w:p>
+        </w:tc>
+        <w:tc>
+          <w:tcPr/>
+          <w:p>
+            <w:pPr>
+              <w:pStyle w:val="Compact"/>
+              <w:jc w:val="left"/>
+            </w:pPr>
+            <w:r>
+              <w:t xml:space="preserve">An</w:t>
+            </w:r>
+            <w:r>
+              <w:t xml:space="preserve"> </w:t>
+            </w:r>
+            <w:r>
+              <w:rPr>
+                <w:bCs/>
+                <w:b/>
+              </w:rPr>
+              <w:t xml:space="preserve">HTML</w:t>
+            </w:r>
+            <w:r>
+              <w:t xml:space="preserve"> </w:t>
+            </w:r>
+            <w:r>
+              <w:t xml:space="preserve">browser op (</w:t>
+            </w:r>
+            <w:r>
+              <w:rPr>
+                <w:rStyle w:val="VerbatimChar"/>
+              </w:rPr>
+              <w:t xml:space="preserve">fetchWithBrowser</w:t>
+            </w:r>
+            <w:r>
+              <w:t xml:space="preserve">) already in flight when the scope aborts is likewise driven to settle within the grace bound and surfaces a retryable</w:t>
+            </w:r>
+            <w:r>
+              <w:t xml:space="preserve"> </w:t>
+            </w:r>
+            <w:r>
+              <w:rPr>
+                <w:rStyle w:val="VerbatimChar"/>
+              </w:rPr>
+              <w:t xml:space="preserve">OperationAbortedError</w:t>
+            </w:r>
+            <w:r>
+              <w:t xml:space="preserve">, not a silent</w:t>
+            </w:r>
+            <w:r>
+              <w:t xml:space="preserve"> </w:t>
+            </w:r>
+            <w:r>
+              <w:rPr>
+                <w:rStyle w:val="VerbatimChar"/>
+              </w:rPr>
+              <w:t xml:space="preserve">""</w:t>
+            </w:r>
+          </w:p>
+        </w:tc>
+        <w:tc>
+          <w:tcPr/>
+          <w:p>
+            <w:pPr>
+              <w:pStyle w:val="Compact"/>
+              <w:jc w:val="left"/>
+            </w:pPr>
+            <w:r>
+              <w:rPr>
+                <w:rStyle w:val="VerbatimChar"/>
+              </w:rPr>
+              <w:t xml:space="preserve">browser-inflight-interrupt.test.ts</w:t>
+            </w:r>
+            <w:r>
+              <w:t xml:space="preserve"> </w:t>
+            </w:r>
+            <w:r>
+              <w:t xml:space="preserve">:: B-browser (HTML path)</w:t>
+            </w:r>
+          </w:p>
+        </w:tc>
+        <w:tc>
+          <w:tcPr/>
+          <w:p>
+            <w:pPr>
+              <w:pStyle w:val="Compact"/>
+              <w:jc w:val="left"/>
+            </w:pPr>
+            <w:r>
+              <w:t xml:space="preserve">the held page settles</w:t>
+            </w:r>
+            <w:r>
+              <w:t xml:space="preserve"> </w:t>
+            </w:r>
+            <w:r>
+              <w:rPr>
+                <w:rStyle w:val="VerbatimChar"/>
+              </w:rPr>
+              <w:t xml:space="preserve">settleLatency &lt; 3000 ms</w:t>
+            </w:r>
+            <w:r>
+              <w:t xml:space="preserve"> </w:t>
+            </w:r>
+            <w:r>
+              <w:t xml:space="preserve">after revoke (vs the 8000 ms</w:t>
+            </w:r>
+            <w:r>
+              <w:t xml:space="preserve"> </w:t>
+            </w:r>
+            <w:r>
+              <w:rPr>
+                <w:rStyle w:val="VerbatimChar"/>
+              </w:rPr>
+              <w:t xml:space="preserve">BROWSER_FETCH_TIMEOUT</w:t>
+            </w:r>
+            <w:r>
+              <w:t xml:space="preserve">);</w:t>
+            </w:r>
+            <w:r>
+              <w:t xml:space="preserve"> </w:t>
+            </w:r>
+            <w:r>
+              <w:rPr>
+                <w:rStyle w:val="VerbatimChar"/>
+              </w:rPr>
+              <w:t xml:space="preserve">isOperationAbortedError(err)</w:t>
+            </w:r>
+            <w:r>
+              <w:t xml:space="preserve"> </w:t>
+            </w:r>
+            <w:r>
+              <w:t xml:space="preserve">is true</w:t>
             </w:r>
           </w:p>
         </w:tc>
@@ -5184,7 +5575,7 @@
           <w:bCs/>
           <w:b/>
         </w:rPr>
-        <w:t xml:space="preserve">Mutation proof (5b, this session):</w:t>
+        <w:t xml:space="preserve">Mutation proof (5b.1, prior session):</w:t>
       </w:r>
       <w:r>
         <w:t xml:space="preserve"> </w:t>
@@ -5223,7 +5614,7 @@
         <w:t xml:space="preserve">MUTATION_MARKER_B3 in-flight interrupt disabled</w:t>
       </w:r>
       <w:r>
-        <w:t xml:space="preserve">) makes the test</w:t>
+        <w:t xml:space="preserve">) makes the PDF subtest</w:t>
       </w:r>
       <w:r>
         <w:t xml:space="preserve"> </w:t>
@@ -5282,13 +5673,37 @@
           <w:bCs/>
           <w:b/>
         </w:rPr>
-        <w:t xml:space="preserve">Scope of this fix (honest):</w:t>
-      </w:r>
-      <w:r>
-        <w:t xml:space="preserve"> </w:t>
-      </w:r>
-      <w:r>
-        <w:t xml:space="preserve">the bounded interrupt is wired</w:t>
+        <w:t xml:space="preserve">Mutation proof (5b.2, this session):</w:t>
+      </w:r>
+      <w:r>
+        <w:t xml:space="preserve"> </w:t>
+      </w:r>
+      <w:r>
+        <w:t xml:space="preserve">neutralising the HTML-path wiring only (</w:t>
+      </w:r>
+      <w:r>
+        <w:rPr>
+          <w:rStyle w:val="VerbatimChar"/>
+        </w:rPr>
+        <w:t xml:space="preserve">clearInterrupt = (() =&gt; {}); /* MUTATION_MARKER … */</w:t>
+      </w:r>
+      <w:r>
+        <w:t xml:space="preserve"> </w:t>
+      </w:r>
+      <w:r>
+        <w:t xml:space="preserve">in</w:t>
+      </w:r>
+      <w:r>
+        <w:t xml:space="preserve"> </w:t>
+      </w:r>
+      <w:r>
+        <w:rPr>
+          <w:rStyle w:val="VerbatimChar"/>
+        </w:rPr>
+        <w:t xml:space="preserve">fetchWithBrowser</w:t>
+      </w:r>
+      <w:r>
+        <w:t xml:space="preserve">, leaving the PDF path untouched) makes the</w:t>
       </w:r>
       <w:r>
         <w:t xml:space="preserve"> </w:t>
@@ -5298,40 +5713,22 @@
           <w:bCs/>
           <w:b/>
         </w:rPr>
-        <w:t xml:space="preserve">only</w:t>
-      </w:r>
-      <w:r>
-        <w:t xml:space="preserve"> </w:t>
-      </w:r>
-      <w:r>
-        <w:t xml:space="preserve">into</w:t>
-      </w:r>
-      <w:r>
-        <w:t xml:space="preserve"> </w:t>
-      </w:r>
-      <w:r>
-        <w:rPr>
-          <w:rStyle w:val="VerbatimChar"/>
-        </w:rPr>
-        <w:t xml:space="preserve">fetchPdfViaBrowser</w:t>
-      </w:r>
-      <w:r>
-        <w:t xml:space="preserve">. The</w:t>
-      </w:r>
-      <w:r>
-        <w:t xml:space="preserve"> </w:t>
-      </w:r>
-      <w:r>
-        <w:rPr>
-          <w:rStyle w:val="VerbatimChar"/>
-        </w:rPr>
-        <w:t xml:space="preserve">fetchWithBrowser</w:t>
-      </w:r>
-      <w:r>
-        <w:t xml:space="preserve"> </w:t>
-      </w:r>
-      <w:r>
-        <w:t xml:space="preserve">HTML path is</w:t>
+        <w:t xml:space="preserve">HTML subtest fail at 8108 ms</w:t>
+      </w:r>
+      <w:r>
+        <w:t xml:space="preserve"> </w:t>
+      </w:r>
+      <w:r>
+        <w:t xml:space="preserve">(</w:t>
+      </w:r>
+      <w:r>
+        <w:rPr>
+          <w:rStyle w:val="VerbatimChar"/>
+        </w:rPr>
+        <w:t xml:space="preserve">a latency near BROWSER_FETCH_TIMEOUT=8000ms means fetchWithBrowser is not wired to the interrupt</w:t>
+      </w:r>
+      <w:r>
+        <w:t xml:space="preserve">) while the</w:t>
       </w:r>
       <w:r>
         <w:t xml:space="preserve"> </w:t>
@@ -5341,13 +5738,96 @@
           <w:bCs/>
           <w:b/>
         </w:rPr>
-        <w:t xml:space="preserve">not</w:t>
-      </w:r>
-      <w:r>
-        <w:t xml:space="preserve"> </w:t>
-      </w:r>
-      <w:r>
-        <w:t xml:space="preserve">wired to it — see §6.1 and §7. This row proves the mechanism works on the path it is installed on; it does not claim universal mid-flight interruption.</w:t>
+        <w:t xml:space="preserve">PDF subtest still passes</w:t>
+      </w:r>
+      <w:r>
+        <w:t xml:space="preserve"> </w:t>
+      </w:r>
+      <w:r>
+        <w:t xml:space="preserve">— proving the new HTML wiring is independently load-bearing and is what subtest 5b.2 guards. Reverted clean;</w:t>
+      </w:r>
+      <w:r>
+        <w:t xml:space="preserve"> </w:t>
+      </w:r>
+      <w:r>
+        <w:rPr>
+          <w:rStyle w:val="VerbatimChar"/>
+        </w:rPr>
+        <w:t xml:space="preserve">grep -rn MUTATION_MARKER server/</w:t>
+      </w:r>
+      <w:r>
+        <w:t xml:space="preserve"> </w:t>
+      </w:r>
+      <w:r>
+        <w:t xml:space="preserve">→ none.</w:t>
+      </w:r>
+    </w:p>
+    <w:p>
+      <w:pPr>
+        <w:pStyle w:val="BodyText"/>
+      </w:pPr>
+      <w:r>
+        <w:rPr>
+          <w:bCs/>
+          <w:b/>
+        </w:rPr>
+        <w:t xml:space="preserve">Scope of this fix (honest):</w:t>
+      </w:r>
+      <w:r>
+        <w:t xml:space="preserve"> </w:t>
+      </w:r>
+      <w:r>
+        <w:t xml:space="preserve">the bounded interrupt is now wired into</w:t>
+      </w:r>
+      <w:r>
+        <w:t xml:space="preserve"> </w:t>
+      </w:r>
+      <w:r>
+        <w:rPr>
+          <w:bCs/>
+          <w:b/>
+        </w:rPr>
+        <w:t xml:space="preserve">both</w:t>
+      </w:r>
+      <w:r>
+        <w:t xml:space="preserve"> </w:t>
+      </w:r>
+      <w:r>
+        <w:t xml:space="preserve">browser paths (PDF and HTML) and the primed-session path, so the §6.1</w:t>
+      </w:r>
+      <w:r>
+        <w:t xml:space="preserve"> </w:t>
+      </w:r>
+      <w:r>
+        <w:t xml:space="preserve">“</w:t>
+      </w:r>
+      <w:r>
+        <w:t xml:space="preserve">HTML path not wired</w:t>
+      </w:r>
+      <w:r>
+        <w:t xml:space="preserve">”</w:t>
+      </w:r>
+      <w:r>
+        <w:t xml:space="preserve"> </w:t>
+      </w:r>
+      <w:r>
+        <w:t xml:space="preserve">gap from the prior candidate is</w:t>
+      </w:r>
+      <w:r>
+        <w:t xml:space="preserve"> </w:t>
+      </w:r>
+      <w:r>
+        <w:rPr>
+          <w:bCs/>
+          <w:b/>
+        </w:rPr>
+        <w:t xml:space="preserve">resolved</w:t>
+      </w:r>
+      <w:r>
+        <w:t xml:space="preserve"> </w:t>
+      </w:r>
+      <w:r>
+        <w:t xml:space="preserve">(see §6). What remains unproven is the deeper socket-level timeout note in §6.2 and the specific production stalls in §6.4.</w:t>
       </w:r>
     </w:p>
     <w:p>
@@ -5388,7 +5868,23 @@
           <w:bCs/>
           <w:b/>
         </w:rPr>
-        <w:t xml:space="preserve">Active in-page CDP interruption is bounded on one path only.</w:t>
+        <w:t xml:space="preserve">(RESOLVED in this candidate)</w:t>
+      </w:r>
+      <w:r>
+        <w:t xml:space="preserve"> </w:t>
+      </w:r>
+      <w:r>
+        <w:rPr>
+          <w:iCs/>
+          <w:i/>
+        </w:rPr>
+        <w:t xml:space="preserve">Active in-page CDP interruption was bounded on one path only.</w:t>
+      </w:r>
+      <w:r>
+        <w:t xml:space="preserve"> </w:t>
+      </w:r>
+      <w:r>
+        <w:t xml:space="preserve">In the prior candidate</w:t>
       </w:r>
       <w:r>
         <w:t xml:space="preserve"> </w:t>
@@ -5403,70 +5899,50 @@
         <w:t xml:space="preserve"> </w:t>
       </w:r>
       <w:r>
-        <w:t xml:space="preserve">now bounds an in-flight CDP op to</w:t>
-      </w:r>
-      <w:r>
-        <w:t xml:space="preserve"> </w:t>
-      </w:r>
-      <w:r>
-        <w:rPr>
-          <w:rStyle w:val="VerbatimChar"/>
-        </w:rPr>
-        <w:t xml:space="preserve">BROWSER_ABORT_GRACE_MS</w:t>
-      </w:r>
-      <w:r>
-        <w:t xml:space="preserve"> </w:t>
-      </w:r>
-      <w:r>
-        <w:t xml:space="preserve">+ a gate round-trip on the</w:t>
-      </w:r>
-      <w:r>
-        <w:t xml:space="preserve"> </w:t>
-      </w:r>
-      <w:r>
-        <w:rPr>
-          <w:rStyle w:val="VerbatimChar"/>
+        <w:t xml:space="preserve">was wired only into</w:t>
+      </w:r>
+      <w:r>
+        <w:t xml:space="preserve"> </w:t>
+      </w:r>
+      <w:r>
+        <w:rPr>
+          <w:rStyle w:val="VerbatimChar"/>
+        </w:rPr>
+        <w:t xml:space="preserve">fetchPdfViaBrowser</w:t>
+      </w:r>
+      <w:r>
+        <w:t xml:space="preserve">, leaving the</w:t>
+      </w:r>
+      <w:r>
+        <w:t xml:space="preserve"> </w:t>
+      </w:r>
+      <w:r>
+        <w:rPr>
+          <w:rStyle w:val="VerbatimChar"/>
+        </w:rPr>
+        <w:t xml:space="preserve">fetchWithBrowser</w:t>
+      </w:r>
+      <w:r>
+        <w:t xml:space="preserve"> </w:t>
+      </w:r>
+      <w:r>
+        <w:t xml:space="preserve">HTML path un-interruptible. It is</w:t>
+      </w:r>
+      <w:r>
+        <w:t xml:space="preserve"> </w:t>
+      </w:r>
+      <w:r>
+        <w:rPr>
           <w:bCs/>
           <w:b/>
         </w:rPr>
-        <w:t xml:space="preserve">fetchPdfViaBrowser</w:t>
-      </w:r>
-      <w:r>
-        <w:t xml:space="preserve"> </w:t>
-      </w:r>
-      <w:r>
-        <w:t xml:space="preserve">path (§5b, proven with a real Chromium page). The</w:t>
-      </w:r>
-      <w:r>
-        <w:t xml:space="preserve"> </w:t>
-      </w:r>
-      <w:r>
-        <w:rPr>
-          <w:rStyle w:val="VerbatimChar"/>
-          <w:bCs/>
-          <w:b/>
-        </w:rPr>
-        <w:t xml:space="preserve">fetchWithBrowser</w:t>
-      </w:r>
-      <w:r>
-        <w:rPr>
-          <w:bCs/>
-          <w:b/>
-        </w:rPr>
-        <w:t xml:space="preserve"> </w:t>
-      </w:r>
-      <w:r>
-        <w:rPr>
-          <w:bCs/>
-          <w:b/>
-        </w:rPr>
-        <w:t xml:space="preserve">HTML path is still not wired</w:t>
-      </w:r>
-      <w:r>
-        <w:t xml:space="preserve"> </w:t>
-      </w:r>
-      <w:r>
-        <w:t xml:space="preserve">to this helper — an HTTP fetch /</w:t>
+        <w:t xml:space="preserve">now wired into both browser paths and the primed-session path</w:t>
+      </w:r>
+      <w:r>
+        <w:t xml:space="preserve"> </w:t>
+      </w:r>
+      <w:r>
+        <w:t xml:space="preserve">(§5b, lines ~1506/2021/2298), proven with a real Chromium page by the new HTML subtest 5b.2 and its path-isolated mutation (725 ms wired → 8108 ms when neutralised). An HTTP fetch /</w:t>
       </w:r>
       <w:r>
         <w:t xml:space="preserve"> </w:t>
@@ -5496,7 +5972,46 @@
         <w:t xml:space="preserve"> </w:t>
       </w:r>
       <w:r>
-        <w:t xml:space="preserve">/ WAF challenge already executing on that path when the scope aborts is still not torn down mid-operation, and falls back to the next admission gate (B2/B7 refusal), dispatch suppression (B1-3), and ultimately the job-isolation SIGKILL (§5.5). This is a real, named remaining gap.</w:t>
+        <w:t xml:space="preserve">/ WAF challenge already executing on the HTML path when the scope aborts is now driven to settle within</w:t>
+      </w:r>
+      <w:r>
+        <w:t xml:space="preserve"> </w:t>
+      </w:r>
+      <w:r>
+        <w:rPr>
+          <w:rStyle w:val="VerbatimChar"/>
+        </w:rPr>
+        <w:t xml:space="preserve">BROWSER_ABORT_GRACE_MS</w:t>
+      </w:r>
+      <w:r>
+        <w:t xml:space="preserve"> </w:t>
+      </w:r>
+      <w:r>
+        <w:t xml:space="preserve">+ a gate round-trip and surfaces a retryable</w:t>
+      </w:r>
+      <w:r>
+        <w:t xml:space="preserve"> </w:t>
+      </w:r>
+      <w:r>
+        <w:rPr>
+          <w:rStyle w:val="VerbatimChar"/>
+        </w:rPr>
+        <w:t xml:space="preserve">OperationAbortedError</w:t>
+      </w:r>
+      <w:r>
+        <w:t xml:space="preserve">, instead of running to the browser timeout or returning a silent</w:t>
+      </w:r>
+      <w:r>
+        <w:t xml:space="preserve"> </w:t>
+      </w:r>
+      <w:r>
+        <w:rPr>
+          <w:rStyle w:val="VerbatimChar"/>
+        </w:rPr>
+        <w:t xml:space="preserve">""</w:t>
+      </w:r>
+      <w:r>
+        <w:t xml:space="preserve">.</w:t>
       </w:r>
     </w:p>
     <w:p>
@@ -5512,45 +6027,28 @@
           <w:bCs/>
           <w:b/>
         </w:rPr>
-        <w:t xml:space="preserve">Deadline propagation into the browser fetch is bounded, not threaded.</w:t>
-      </w:r>
-      <w:r>
-        <w:t xml:space="preserve"> </w:t>
-      </w:r>
-      <w:r>
-        <w:t xml:space="preserve">B1 proves the scope is</w:t>
-      </w:r>
-      <w:r>
-        <w:t xml:space="preserve"> </w:t>
-      </w:r>
-      <w:r>
-        <w:rPr>
-          <w:iCs/>
-          <w:i/>
-        </w:rPr>
-        <w:t xml:space="preserve">passed</w:t>
-      </w:r>
-      <w:r>
-        <w:t xml:space="preserve"> </w:t>
-      </w:r>
-      <w:r>
-        <w:t xml:space="preserve">to the fetch boundary and that</w:t>
-      </w:r>
-      <w:r>
-        <w:t xml:space="preserve"> </w:t>
-      </w:r>
-      <w:r>
-        <w:rPr>
-          <w:iCs/>
-          <w:i/>
-        </w:rPr>
-        <w:t xml:space="preserve">dispatch</w:t>
-      </w:r>
-      <w:r>
-        <w:t xml:space="preserve"> </w:t>
-      </w:r>
-      <w:r>
-        <w:t xml:space="preserve">stops after the deadline; it does not prove a per-request network/socket timeout equal to</w:t>
+        <w:t xml:space="preserve">Deadline is now threaded into the browser fetch at the navigation + settle layers; a deep per-socket timeout is still not asserted.</w:t>
+      </w:r>
+      <w:r>
+        <w:t xml:space="preserve"> </w:t>
+      </w:r>
+      <w:r>
+        <w:t xml:space="preserve">Since</w:t>
+      </w:r>
+      <w:r>
+        <w:t xml:space="preserve"> </w:t>
+      </w:r>
+      <w:r>
+        <w:rPr>
+          <w:rStyle w:val="VerbatimChar"/>
+        </w:rPr>
+        <w:t xml:space="preserve">658a17c</w:t>
+      </w:r>
+      <w:r>
+        <w:t xml:space="preserve"> </w:t>
+      </w:r>
+      <w:r>
+        <w:t xml:space="preserve">the per-navigation timeouts are clamped to</w:t>
       </w:r>
       <w:r>
         <w:t xml:space="preserve"> </w:t>
@@ -5565,19 +6063,96 @@
         <w:t xml:space="preserve"> </w:t>
       </w:r>
       <w:r>
-        <w:t xml:space="preserve">is applied inside</w:t>
-      </w:r>
-      <w:r>
-        <w:t xml:space="preserve"> </w:t>
-      </w:r>
-      <w:r>
-        <w:rPr>
-          <w:rStyle w:val="VerbatimChar"/>
-        </w:rPr>
-        <w:t xml:space="preserve">fetchIssuerPdfsWithPrimedSession</w:t>
-      </w:r>
-      <w:r>
-        <w:t xml:space="preserve">. The effective ceiling on an already-started browser fetch on the un-wired path is the pipeline deadline → SIGKILL, not a scope-derived socket timeout.</w:t>
+        <w:t xml:space="preserve">(</w:t>
+      </w:r>
+      <w:r>
+        <w:rPr>
+          <w:rStyle w:val="VerbatimChar"/>
+        </w:rPr>
+        <w:t xml:space="preserve">gotoTimeout = base =&gt; scope ? max(1, min(base, scope.remainingMs())) : base</w:t>
+      </w:r>
+      <w:r>
+        <w:t xml:space="preserve">, lines ~1496/2009), and this candidate makes the two post-navigation settle waits abort-aware via</w:t>
+      </w:r>
+      <w:r>
+        <w:t xml:space="preserve"> </w:t>
+      </w:r>
+      <w:r>
+        <w:rPr>
+          <w:rStyle w:val="VerbatimChar"/>
+        </w:rPr>
+        <w:t xml:space="preserve">abortableDelay</w:t>
+      </w:r>
+      <w:r>
+        <w:t xml:space="preserve"> </w:t>
+      </w:r>
+      <w:r>
+        <w:t xml:space="preserve">— so on both browser paths the effective ceiling on an in-flight fetch is now the scope deadline (via clamped nav timeout) or the grace bound (via the interrupt),</w:t>
+      </w:r>
+      <w:r>
+        <w:t xml:space="preserve"> </w:t>
+      </w:r>
+      <w:r>
+        <w:rPr>
+          <w:bCs/>
+          <w:b/>
+        </w:rPr>
+        <w:t xml:space="preserve">not</w:t>
+      </w:r>
+      <w:r>
+        <w:t xml:space="preserve"> </w:t>
+      </w:r>
+      <w:r>
+        <w:t xml:space="preserve">the pipeline-deadline → SIGKILL fallback. What is still</w:t>
+      </w:r>
+      <w:r>
+        <w:t xml:space="preserve"> </w:t>
+      </w:r>
+      <w:r>
+        <w:rPr>
+          <w:bCs/>
+          <w:b/>
+        </w:rPr>
+        <w:t xml:space="preserve">not</w:t>
+      </w:r>
+      <w:r>
+        <w:t xml:space="preserve"> </w:t>
+      </w:r>
+      <w:r>
+        <w:t xml:space="preserve">independently asserted by a test is a per-request TCP/socket read timeout equal to</w:t>
+      </w:r>
+      <w:r>
+        <w:t xml:space="preserve"> </w:t>
+      </w:r>
+      <w:r>
+        <w:rPr>
+          <w:rStyle w:val="VerbatimChar"/>
+        </w:rPr>
+        <w:t xml:space="preserve">remainingMs</w:t>
+      </w:r>
+      <w:r>
+        <w:t xml:space="preserve"> </w:t>
+      </w:r>
+      <w:r>
+        <w:t xml:space="preserve">inside the lowest-level puppeteer/CDP transport; the abort path tears the page down within the grace bound, which supersedes that socket in practice, but no test pins the socket layer itself. This is the honest residual of the former</w:t>
+      </w:r>
+      <w:r>
+        <w:t xml:space="preserve"> </w:t>
+      </w:r>
+      <w:r>
+        <w:t xml:space="preserve">“</w:t>
+      </w:r>
+      <w:r>
+        <w:t xml:space="preserve">bounded, not threaded</w:t>
+      </w:r>
+      <w:r>
+        <w:t xml:space="preserve">”</w:t>
+      </w:r>
+      <w:r>
+        <w:t xml:space="preserve"> </w:t>
+      </w:r>
+      <w:r>
+        <w:t xml:space="preserve">gap.</w:t>
       </w:r>
     </w:p>
     <w:p>
@@ -5593,7 +6168,7 @@
           <w:bCs/>
           <w:b/>
         </w:rPr>
-        <w:t xml:space="preserve">(RESOLVED in this candidate)</w:t>
+        <w:t xml:space="preserve">(RESOLVED in the prior candidate)</w:t>
       </w:r>
       <w:r>
         <w:t xml:space="preserve"> </w:t>
@@ -5673,7 +6248,7 @@
           <w:bCs/>
           <w:b/>
         </w:rPr>
-        <w:t xml:space="preserve">Specific production stalls remain unobserved.</w:t>
+        <w:t xml:space="preserve">Specific production stalls remain unobserved — the live-validation gap.</w:t>
       </w:r>
       <w:r>
         <w:t xml:space="preserve"> </w:t>
@@ -5691,7 +6266,36 @@
         <w:t xml:space="preserve">TIMEOUT_INVESTIGATION.md</w:t>
       </w:r>
       <w:r>
-        <w:t xml:space="preserve">) are not reproduced by any test here; they are out of scope for this cancellation patch and are not claimed fixed.</w:t>
+        <w:t xml:space="preserve">) are</w:t>
+      </w:r>
+      <w:r>
+        <w:t xml:space="preserve"> </w:t>
+      </w:r>
+      <w:r>
+        <w:rPr>
+          <w:bCs/>
+          <w:b/>
+        </w:rPr>
+        <w:t xml:space="preserve">not</w:t>
+      </w:r>
+      <w:r>
+        <w:t xml:space="preserve"> </w:t>
+      </w:r>
+      <w:r>
+        <w:t xml:space="preserve">reproduced by any test here, and this patch has had</w:t>
+      </w:r>
+      <w:r>
+        <w:t xml:space="preserve"> </w:t>
+      </w:r>
+      <w:r>
+        <w:rPr>
+          <w:bCs/>
+          <w:b/>
+        </w:rPr>
+        <w:t xml:space="preserve">no live exercise</w:t>
+      </w:r>
+      <w:r>
+        <w:t xml:space="preserve">: no batch run, no paid/Railway run, no real web/LLM fetch (all forbidden by the delivery constraints). The cancellation machinery is proven at the boundaries enumerated above with real Chromium / subprocess / fork+IPC / Postgres, but whether it actually shortens those two specific production stalls can only be observed on a real run. That first real exercise is the post-deploy dashboard test, which stays with the reviewer; nothing in this document should be read as claiming those stalls are fixed.</w:t>
       </w:r>
     </w:p>
     <w:p>
@@ -6702,31 +7306,47 @@
               <w:jc w:val="left"/>
             </w:pPr>
             <w:r>
-              <w:t xml:space="preserve">Bounded in-flight page interrupt (PDF path)</w:t>
-            </w:r>
-          </w:p>
-        </w:tc>
-        <w:tc>
-          <w:tcPr/>
-          <w:p>
-            <w:pPr>
-              <w:pStyle w:val="Compact"/>
-              <w:jc w:val="left"/>
-            </w:pPr>
-            <w:r>
-              <w:t xml:space="preserve">1 subtest</w:t>
-            </w:r>
-          </w:p>
-        </w:tc>
-        <w:tc>
-          <w:tcPr/>
-          <w:p>
-            <w:pPr>
-              <w:pStyle w:val="Compact"/>
-              <w:jc w:val="left"/>
-            </w:pPr>
-            <w:r>
-              <w:t xml:space="preserve">onAbort no-op → 8169 ms vs &lt; 3000 ms</w:t>
+              <w:t xml:space="preserve">Bounded in-flight page interrupt (PDF</w:t>
+            </w:r>
+            <w:r>
+              <w:t xml:space="preserve"> </w:t>
+            </w:r>
+            <w:r>
+              <w:rPr>
+                <w:bCs/>
+                <w:b/>
+              </w:rPr>
+              <w:t xml:space="preserve">and</w:t>
+            </w:r>
+            <w:r>
+              <w:t xml:space="preserve"> </w:t>
+            </w:r>
+            <w:r>
+              <w:t xml:space="preserve">HTML paths)</w:t>
+            </w:r>
+          </w:p>
+        </w:tc>
+        <w:tc>
+          <w:tcPr/>
+          <w:p>
+            <w:pPr>
+              <w:pStyle w:val="Compact"/>
+              <w:jc w:val="left"/>
+            </w:pPr>
+            <w:r>
+              <w:t xml:space="preserve">2 subtests (PDF 5b.1, HTML 5b.2)</w:t>
+            </w:r>
+          </w:p>
+        </w:tc>
+        <w:tc>
+          <w:tcPr/>
+          <w:p>
+            <w:pPr>
+              <w:pStyle w:val="Compact"/>
+              <w:jc w:val="left"/>
+            </w:pPr>
+            <w:r>
+              <w:t xml:space="preserve">PDF onAbort no-op → 8169 ms; HTML-path wiring neutralised → 8108 ms (PDF subtest still passes) — both vs &lt; 3000 ms</w:t>
             </w:r>
           </w:p>
         </w:tc>
@@ -6835,7 +7455,7 @@
           <w:bCs/>
           <w:b/>
         </w:rPr>
-        <w:t xml:space="preserve">45cc661</w:t>
+        <w:t xml:space="preserve">6e09ced</w:t>
       </w:r>
       <w:r>
         <w:rPr>
@@ -6848,7 +7468,7 @@
         <w:t xml:space="preserve"> </w:t>
       </w:r>
       <w:r>
-        <w:t xml:space="preserve">33</w:t>
+        <w:t xml:space="preserve">34</w:t>
       </w:r>
       <w:r>
         <w:t xml:space="preserve"> </w:t>
@@ -6863,7 +7483,23 @@
         <w:t xml:space="preserve"> </w:t>
       </w:r>
       <w:r>
-        <w:t xml:space="preserve">subtests across 10 files (operation-scoped-cancellation 7, company-pdf-recovery-boundary 7, cancellable-proc-admission-boundary 4, inflight-coalescing-boundary 3, stalled-extraction-boundary 2, pdf-parse-subprocess-equivalence 2, browser-close-order 4, browser-inflight-interrupt 1, isolated-proc-admission-boundary 1, unattempted-cancelled-boundary 2) +</w:t>
+        <w:t xml:space="preserve">subtests across 10 files (operation-scoped-cancellation 7, company-pdf-recovery-boundary 7, cancellable-proc-admission-boundary 4, inflight-coalescing-boundary 3, stalled-extraction-boundary 2, pdf-parse-subprocess-equivalence 2, browser-close-order 4, browser-inflight-interrupt</w:t>
+      </w:r>
+      <w:r>
+        <w:t xml:space="preserve"> </w:t>
+      </w:r>
+      <w:r>
+        <w:rPr>
+          <w:bCs/>
+          <w:b/>
+        </w:rPr>
+        <w:t xml:space="preserve">2</w:t>
+      </w:r>
+      <w:r>
+        <w:t xml:space="preserve"> </w:t>
+      </w:r>
+      <w:r>
+        <w:t xml:space="preserve">(PDF + HTML), isolated-proc-admission-boundary 1, unattempted-cancelled-boundary 2) +</w:t>
       </w:r>
       <w:r>
         <w:t xml:space="preserve"> </w:t>
@@ -6878,7 +7514,17 @@
         <w:t xml:space="preserve"> </w:t>
       </w:r>
       <w:r>
-        <w:t xml:space="preserve">(60 passed, 0 failed; custom runner). 0 failures anywhere.</w:t>
+        <w:t xml:space="preserve">(60 passed, 0 failed; custom runner).</w:t>
+      </w:r>
+      <w:r>
+        <w:t xml:space="preserve"> </w:t>
+      </w:r>
+      <w:r>
+        <w:rPr>
+          <w:bCs/>
+          <w:b/>
+        </w:rPr>
+        <w:t xml:space="preserve">94 total checks, 0 failures anywhere.</w:t>
       </w:r>
     </w:p>
     <w:p>
@@ -6914,22 +7560,19 @@
         <w:t xml:space="preserve"> </w:t>
       </w:r>
       <w:r>
-        <w:t xml:space="preserve">→ none;</w:t>
-      </w:r>
-      <w:r>
-        <w:t xml:space="preserve"> </w:t>
-      </w:r>
-      <w:r>
-        <w:rPr>
-          <w:rStyle w:val="VerbatimChar"/>
-        </w:rPr>
-        <w:t xml:space="preserve">git diff --quiet HEAD -- server/lib/processor.ts server/lib/pipeline.ts</w:t>
-      </w:r>
-      <w:r>
-        <w:t xml:space="preserve"> </w:t>
-      </w:r>
-      <w:r>
-        <w:t xml:space="preserve">→ clean). The gaps in §6 are real and are the honest boundary of what the suite proves.</w:t>
+        <w:t xml:space="preserve">→ none). At the candidate commit the working tree is clean (</w:t>
+      </w:r>
+      <w:r>
+        <w:rPr>
+          <w:rStyle w:val="VerbatimChar"/>
+        </w:rPr>
+        <w:t xml:space="preserve">git status --short</w:t>
+      </w:r>
+      <w:r>
+        <w:t xml:space="preserve"> </w:t>
+      </w:r>
+      <w:r>
+        <w:t xml:space="preserve">shows no tracked-source changes). The gaps in §6 are real and are the honest boundary of what the suite proves; item §6.4 (live validation of the Idemitsu/AXA stalls) remains the one honest gap carried forward — it requires a real run, which the delivery constraints forbid.</w:t>
       </w:r>
     </w:p>
     <w:bookmarkEnd w:id="30"/>

</xml_diff>